<commit_message>
feat: Streamline letter queue and template management
- Implement a modal for adding notes when marking letter queues as 'completed'.
- Remove redundant `edit` and `show` views for letter queues, centralizing status updates on the index page.
- Add a download feature for template files in the admin panel.
- Correct the 'NIM' data item input type from 'text' to 'number'.
- Update various views for consistency and improved user experience.
- Add an additional user to the database seeder.
</commit_message>
<xml_diff>
--- a/storage/app/public/templates/Surat Pengantar Kerja Praktik.docx
+++ b/storage/app/public/templates/Surat Pengantar Kerja Praktik.docx
@@ -418,26 +418,14 @@
         <w:rPr>
           <w:color w:val="000000"/>
         </w:rPr>
-        <w:t>T</w:t>
-      </w:r>
-      <w:r>
-        <w:rPr>
-          <w:color w:val="000000"/>
-        </w:rPr>
-        <w:t>asikmalaya</w:t>
-      </w:r>
-      <w:proofErr w:type="spellEnd"/>
-      <w:r>
-        <w:rPr>
-          <w:color w:val="000000"/>
-        </w:rPr>
-        <w:t>,</w:t>
-      </w:r>
-      <w:r>
-        <w:rPr>
-          <w:color w:val="000000"/>
-        </w:rPr>
-        <w:t>$</w:t>
+        <w:t>Tasikmalaya</w:t>
+      </w:r>
+      <w:proofErr w:type="spellEnd"/>
+      <w:r>
+        <w:rPr>
+          <w:color w:val="000000"/>
+        </w:rPr>
+        <w:t>,$</w:t>
       </w:r>
       <w:proofErr w:type="gramEnd"/>
       <w:r>
@@ -508,13 +496,7 @@
           <w:color w:val="000000"/>
         </w:rPr>
         <w:tab/>
-        <w:t>:</w:t>
-      </w:r>
-      <w:r>
-        <w:rPr>
-          <w:color w:val="000000"/>
-        </w:rPr>
-        <w:t xml:space="preserve">   ${</w:t>
+        <w:t>:   ${</w:t>
       </w:r>
       <w:proofErr w:type="spellStart"/>
       <w:r>
@@ -528,31 +510,7 @@
         <w:rPr>
           <w:color w:val="000000"/>
         </w:rPr>
-        <w:t>}</w:t>
-      </w:r>
-      <w:r>
-        <w:rPr>
-          <w:color w:val="000000"/>
-        </w:rPr>
-        <w:t>/</w:t>
-      </w:r>
-      <w:r>
-        <w:rPr>
-          <w:color w:val="000000"/>
-        </w:rPr>
-        <w:t>KP</w:t>
-      </w:r>
-      <w:r>
-        <w:rPr>
-          <w:color w:val="000000"/>
-        </w:rPr>
-        <w:t>/FT-UP</w:t>
-      </w:r>
-      <w:r>
-        <w:rPr>
-          <w:color w:val="000000"/>
-        </w:rPr>
-        <w:t>/${</w:t>
+        <w:t>}/KP/FT-UP/${</w:t>
       </w:r>
       <w:proofErr w:type="spellStart"/>
       <w:r>
@@ -607,13 +565,7 @@
           <w:color w:val="000000"/>
         </w:rPr>
         <w:tab/>
-        <w:t xml:space="preserve">: </w:t>
-      </w:r>
-      <w:r>
-        <w:rPr>
-          <w:color w:val="000000"/>
-        </w:rPr>
-        <w:t xml:space="preserve">  -</w:t>
+        <w:t>:   -</w:t>
       </w:r>
     </w:p>
     <w:p>
@@ -648,13 +600,7 @@
           <w:color w:val="000000"/>
         </w:rPr>
         <w:tab/>
-        <w:t xml:space="preserve">: </w:t>
-      </w:r>
-      <w:r>
-        <w:rPr>
-          <w:color w:val="000000"/>
-        </w:rPr>
-        <w:t xml:space="preserve">  </w:t>
+        <w:t xml:space="preserve">:   </w:t>
       </w:r>
       <w:proofErr w:type="spellStart"/>
       <w:r>
@@ -795,13 +741,7 @@
           <w:color w:val="000000"/>
         </w:rPr>
         <w:tab/>
-        <w:t>:</w:t>
-      </w:r>
-      <w:r>
-        <w:rPr>
-          <w:color w:val="000000"/>
-        </w:rPr>
-        <w:t xml:space="preserve">   Dekan</w:t>
+        <w:t>:   Dekan</w:t>
       </w:r>
     </w:p>
     <w:p>
@@ -988,13 +928,7 @@
           <w:color w:val="000000"/>
         </w:rPr>
         <w:tab/>
-        <w:t xml:space="preserve"> </w:t>
-      </w:r>
-      <w:r>
-        <w:rPr>
-          <w:color w:val="000000"/>
-        </w:rPr>
-        <w:t xml:space="preserve"> </w:t>
+        <w:t xml:space="preserve">  </w:t>
       </w:r>
     </w:p>
     <w:p>
@@ -1645,6 +1579,287 @@
         </w:rPr>
       </w:pPr>
     </w:p>
+    <w:tbl>
+      <w:tblPr>
+        <w:tblStyle w:val="TableGrid"/>
+        <w:tblW w:w="0" w:type="auto"/>
+        <w:tblInd w:w="1440" w:type="dxa"/>
+        <w:tblBorders>
+          <w:top w:val="none" w:sz="0" w:space="0" w:color="auto"/>
+          <w:left w:val="none" w:sz="0" w:space="0" w:color="auto"/>
+          <w:bottom w:val="none" w:sz="0" w:space="0" w:color="auto"/>
+          <w:right w:val="none" w:sz="0" w:space="0" w:color="auto"/>
+          <w:insideH w:val="none" w:sz="0" w:space="0" w:color="auto"/>
+          <w:insideV w:val="none" w:sz="0" w:space="0" w:color="auto"/>
+        </w:tblBorders>
+        <w:tblLook w:val="04A0" w:firstRow="1" w:lastRow="0" w:firstColumn="1" w:lastColumn="0" w:noHBand="0" w:noVBand="1"/>
+      </w:tblPr>
+      <w:tblGrid>
+        <w:gridCol w:w="2383"/>
+        <w:gridCol w:w="283"/>
+        <w:gridCol w:w="4910"/>
+      </w:tblGrid>
+      <w:tr>
+        <w:tc>
+          <w:tcPr>
+            <w:tcW w:w="2383" w:type="dxa"/>
+          </w:tcPr>
+          <w:p>
+            <w:pPr>
+              <w:jc w:val="both"/>
+              <w:rPr>
+                <w:color w:val="000000"/>
+              </w:rPr>
+            </w:pPr>
+            <w:r>
+              <w:rPr>
+                <w:color w:val="000000"/>
+              </w:rPr>
+              <w:t>Nama</w:t>
+            </w:r>
+          </w:p>
+        </w:tc>
+        <w:tc>
+          <w:tcPr>
+            <w:tcW w:w="283" w:type="dxa"/>
+          </w:tcPr>
+          <w:p>
+            <w:pPr>
+              <w:jc w:val="center"/>
+              <w:rPr>
+                <w:color w:val="000000"/>
+              </w:rPr>
+            </w:pPr>
+            <w:r>
+              <w:rPr>
+                <w:color w:val="000000"/>
+              </w:rPr>
+              <w:t>:</w:t>
+            </w:r>
+          </w:p>
+        </w:tc>
+        <w:tc>
+          <w:tcPr>
+            <w:tcW w:w="4910" w:type="dxa"/>
+          </w:tcPr>
+          <w:p>
+            <w:pPr>
+              <w:jc w:val="both"/>
+              <w:rPr>
+                <w:color w:val="000000"/>
+              </w:rPr>
+            </w:pPr>
+            <w:r>
+              <w:rPr>
+                <w:color w:val="000000"/>
+              </w:rPr>
+              <w:t>${nama}</w:t>
+            </w:r>
+          </w:p>
+        </w:tc>
+      </w:tr>
+      <w:tr>
+        <w:tc>
+          <w:tcPr>
+            <w:tcW w:w="2383" w:type="dxa"/>
+          </w:tcPr>
+          <w:p>
+            <w:pPr>
+              <w:jc w:val="both"/>
+              <w:rPr>
+                <w:color w:val="000000"/>
+              </w:rPr>
+            </w:pPr>
+            <w:r>
+              <w:rPr>
+                <w:color w:val="000000"/>
+              </w:rPr>
+              <w:t>NIM</w:t>
+            </w:r>
+          </w:p>
+        </w:tc>
+        <w:tc>
+          <w:tcPr>
+            <w:tcW w:w="283" w:type="dxa"/>
+          </w:tcPr>
+          <w:p>
+            <w:pPr>
+              <w:jc w:val="center"/>
+              <w:rPr>
+                <w:color w:val="000000"/>
+              </w:rPr>
+            </w:pPr>
+            <w:r>
+              <w:rPr>
+                <w:color w:val="000000"/>
+              </w:rPr>
+              <w:t>:</w:t>
+            </w:r>
+          </w:p>
+        </w:tc>
+        <w:tc>
+          <w:tcPr>
+            <w:tcW w:w="4910" w:type="dxa"/>
+          </w:tcPr>
+          <w:p>
+            <w:pPr>
+              <w:jc w:val="both"/>
+              <w:rPr>
+                <w:color w:val="000000"/>
+              </w:rPr>
+            </w:pPr>
+            <w:r>
+              <w:rPr>
+                <w:color w:val="000000"/>
+              </w:rPr>
+              <w:t>${nim}</w:t>
+            </w:r>
+          </w:p>
+        </w:tc>
+      </w:tr>
+      <w:tr>
+        <w:tc>
+          <w:tcPr>
+            <w:tcW w:w="2383" w:type="dxa"/>
+          </w:tcPr>
+          <w:p>
+            <w:pPr>
+              <w:jc w:val="both"/>
+              <w:rPr>
+                <w:color w:val="000000"/>
+              </w:rPr>
+            </w:pPr>
+            <w:proofErr w:type="spellStart"/>
+            <w:r>
+              <w:rPr>
+                <w:color w:val="000000"/>
+              </w:rPr>
+              <w:t>Judul</w:t>
+            </w:r>
+            <w:proofErr w:type="spellEnd"/>
+          </w:p>
+        </w:tc>
+        <w:tc>
+          <w:tcPr>
+            <w:tcW w:w="283" w:type="dxa"/>
+          </w:tcPr>
+          <w:p>
+            <w:pPr>
+              <w:jc w:val="center"/>
+              <w:rPr>
+                <w:color w:val="000000"/>
+              </w:rPr>
+            </w:pPr>
+            <w:r>
+              <w:rPr>
+                <w:color w:val="000000"/>
+              </w:rPr>
+              <w:t>:</w:t>
+            </w:r>
+          </w:p>
+        </w:tc>
+        <w:tc>
+          <w:tcPr>
+            <w:tcW w:w="4910" w:type="dxa"/>
+          </w:tcPr>
+          <w:p>
+            <w:pPr>
+              <w:jc w:val="both"/>
+              <w:rPr>
+                <w:color w:val="000000"/>
+              </w:rPr>
+            </w:pPr>
+            <w:r>
+              <w:rPr>
+                <w:color w:val="000000"/>
+              </w:rPr>
+              <w:t>${</w:t>
+            </w:r>
+            <w:proofErr w:type="spellStart"/>
+            <w:r>
+              <w:rPr>
+                <w:color w:val="000000"/>
+              </w:rPr>
+              <w:t>judulKP</w:t>
+            </w:r>
+            <w:proofErr w:type="spellEnd"/>
+            <w:r>
+              <w:rPr>
+                <w:color w:val="000000"/>
+              </w:rPr>
+              <w:t>}</w:t>
+            </w:r>
+          </w:p>
+        </w:tc>
+      </w:tr>
+      <w:tr>
+        <w:tc>
+          <w:tcPr>
+            <w:tcW w:w="2383" w:type="dxa"/>
+          </w:tcPr>
+          <w:p>
+            <w:pPr>
+              <w:jc w:val="both"/>
+              <w:rPr>
+                <w:color w:val="000000"/>
+              </w:rPr>
+            </w:pPr>
+            <w:r>
+              <w:rPr>
+                <w:color w:val="000000"/>
+              </w:rPr>
+              <w:t xml:space="preserve">Data yang </w:t>
+            </w:r>
+            <w:proofErr w:type="spellStart"/>
+            <w:r>
+              <w:rPr>
+                <w:color w:val="000000"/>
+              </w:rPr>
+              <w:t>diperlukan</w:t>
+            </w:r>
+            <w:proofErr w:type="spellEnd"/>
+          </w:p>
+        </w:tc>
+        <w:tc>
+          <w:tcPr>
+            <w:tcW w:w="283" w:type="dxa"/>
+          </w:tcPr>
+          <w:p>
+            <w:pPr>
+              <w:jc w:val="center"/>
+              <w:rPr>
+                <w:color w:val="000000"/>
+              </w:rPr>
+            </w:pPr>
+            <w:r>
+              <w:rPr>
+                <w:color w:val="000000"/>
+              </w:rPr>
+              <w:t>:</w:t>
+            </w:r>
+          </w:p>
+        </w:tc>
+        <w:tc>
+          <w:tcPr>
+            <w:tcW w:w="4910" w:type="dxa"/>
+          </w:tcPr>
+          <w:p>
+            <w:pPr>
+              <w:jc w:val="both"/>
+              <w:rPr>
+                <w:color w:val="000000"/>
+              </w:rPr>
+            </w:pPr>
+            <w:r>
+              <w:rPr>
+                <w:color w:val="000000"/>
+              </w:rPr>
+              <w:t>${data}</w:t>
+            </w:r>
+          </w:p>
+        </w:tc>
+      </w:tr>
+    </w:tbl>
     <w:p>
       <w:pPr>
         <w:pBdr>
@@ -1660,51 +1875,6 @@
           <w:color w:val="000000"/>
         </w:rPr>
       </w:pPr>
-      <w:r>
-        <w:rPr>
-          <w:color w:val="000000"/>
-        </w:rPr>
-        <w:t>Nama</w:t>
-      </w:r>
-      <w:r>
-        <w:rPr>
-          <w:color w:val="000000"/>
-        </w:rPr>
-        <w:tab/>
-      </w:r>
-      <w:r>
-        <w:rPr>
-          <w:color w:val="000000"/>
-        </w:rPr>
-        <w:tab/>
-      </w:r>
-      <w:proofErr w:type="gramStart"/>
-      <w:r>
-        <w:rPr>
-          <w:color w:val="000000"/>
-        </w:rPr>
-        <w:tab/>
-        <w:t xml:space="preserve"> </w:t>
-      </w:r>
-      <w:r>
-        <w:rPr>
-          <w:color w:val="000000"/>
-        </w:rPr>
-        <w:t>:</w:t>
-      </w:r>
-      <w:proofErr w:type="gramEnd"/>
-      <w:r>
-        <w:rPr>
-          <w:color w:val="000000"/>
-        </w:rPr>
-        <w:t xml:space="preserve"> </w:t>
-      </w:r>
-      <w:r>
-        <w:rPr>
-          <w:color w:val="000000"/>
-        </w:rPr>
-        <w:t>${nama}</w:t>
-      </w:r>
     </w:p>
     <w:p>
       <w:pPr>
@@ -1721,211 +1891,124 @@
           <w:color w:val="000000"/>
         </w:rPr>
       </w:pPr>
-      <w:r>
-        <w:rPr>
-          <w:color w:val="000000"/>
-        </w:rPr>
-        <w:t>NIM</w:t>
-      </w:r>
-      <w:r>
-        <w:rPr>
-          <w:color w:val="000000"/>
-        </w:rPr>
-        <w:tab/>
-      </w:r>
-      <w:r>
-        <w:rPr>
-          <w:color w:val="000000"/>
-        </w:rPr>
-        <w:tab/>
-      </w:r>
-      <w:proofErr w:type="gramStart"/>
-      <w:r>
-        <w:rPr>
-          <w:color w:val="000000"/>
-        </w:rPr>
-        <w:tab/>
+      <w:proofErr w:type="spellStart"/>
+      <w:r>
+        <w:rPr>
+          <w:color w:val="000000"/>
+        </w:rPr>
+        <w:t>Demikianlah</w:t>
+      </w:r>
+      <w:proofErr w:type="spellEnd"/>
+      <w:r>
+        <w:rPr>
+          <w:color w:val="000000"/>
+        </w:rPr>
         <w:t xml:space="preserve"> </w:t>
       </w:r>
-      <w:r>
-        <w:rPr>
-          <w:color w:val="000000"/>
-        </w:rPr>
-        <w:t>:</w:t>
-      </w:r>
-      <w:proofErr w:type="gramEnd"/>
+      <w:proofErr w:type="spellStart"/>
+      <w:r>
+        <w:rPr>
+          <w:color w:val="000000"/>
+        </w:rPr>
+        <w:t>surat</w:t>
+      </w:r>
+      <w:proofErr w:type="spellEnd"/>
       <w:r>
         <w:rPr>
           <w:color w:val="000000"/>
         </w:rPr>
         <w:t xml:space="preserve"> </w:t>
       </w:r>
-      <w:r>
-        <w:rPr>
-          <w:color w:val="000000"/>
-        </w:rPr>
-        <w:t>${nim}</w:t>
-      </w:r>
-    </w:p>
-    <w:p>
-      <w:pPr>
-        <w:pBdr>
-          <w:top w:val="nil"/>
-          <w:left w:val="nil"/>
-          <w:bottom w:val="nil"/>
-          <w:right w:val="nil"/>
-          <w:between w:val="nil"/>
-        </w:pBdr>
-        <w:ind w:left="1440"/>
-        <w:jc w:val="both"/>
-        <w:rPr>
-          <w:color w:val="000000"/>
-        </w:rPr>
-      </w:pPr>
-      <w:proofErr w:type="spellStart"/>
-      <w:r>
-        <w:rPr>
-          <w:color w:val="000000"/>
-        </w:rPr>
-        <w:t>Judul</w:t>
-      </w:r>
-      <w:proofErr w:type="spellEnd"/>
-      <w:r>
-        <w:rPr>
-          <w:color w:val="000000"/>
-        </w:rPr>
-        <w:tab/>
-      </w:r>
-      <w:r>
-        <w:rPr>
-          <w:color w:val="000000"/>
-        </w:rPr>
-        <w:tab/>
-      </w:r>
-      <w:proofErr w:type="gramStart"/>
-      <w:r>
-        <w:rPr>
-          <w:color w:val="000000"/>
-        </w:rPr>
-        <w:tab/>
+      <w:proofErr w:type="spellStart"/>
+      <w:r>
+        <w:rPr>
+          <w:color w:val="000000"/>
+        </w:rPr>
+        <w:t>pengantar</w:t>
+      </w:r>
+      <w:proofErr w:type="spellEnd"/>
+      <w:r>
+        <w:rPr>
+          <w:color w:val="000000"/>
+        </w:rPr>
         <w:t xml:space="preserve"> </w:t>
       </w:r>
-      <w:r>
-        <w:rPr>
-          <w:color w:val="000000"/>
-        </w:rPr>
-        <w:t>:</w:t>
-      </w:r>
-      <w:proofErr w:type="gramEnd"/>
+      <w:proofErr w:type="spellStart"/>
+      <w:r>
+        <w:rPr>
+          <w:color w:val="000000"/>
+        </w:rPr>
+        <w:t>Kerja</w:t>
+      </w:r>
+      <w:proofErr w:type="spellEnd"/>
       <w:r>
         <w:rPr>
           <w:color w:val="000000"/>
         </w:rPr>
         <w:t xml:space="preserve"> </w:t>
       </w:r>
-      <w:r>
-        <w:rPr>
-          <w:color w:val="000000"/>
-        </w:rPr>
-        <w:t>${</w:t>
-      </w:r>
-      <w:proofErr w:type="spellStart"/>
-      <w:r>
-        <w:rPr>
-          <w:color w:val="000000"/>
-        </w:rPr>
-        <w:t>judulKP</w:t>
-      </w:r>
-      <w:proofErr w:type="spellEnd"/>
-      <w:r>
-        <w:rPr>
-          <w:color w:val="000000"/>
-        </w:rPr>
-        <w:t>}</w:t>
-      </w:r>
-    </w:p>
-    <w:p>
-      <w:pPr>
-        <w:pBdr>
-          <w:top w:val="nil"/>
-          <w:left w:val="nil"/>
-          <w:bottom w:val="nil"/>
-          <w:right w:val="nil"/>
-          <w:between w:val="nil"/>
-        </w:pBdr>
-        <w:ind w:left="1440"/>
-        <w:jc w:val="both"/>
-        <w:rPr>
-          <w:color w:val="000000"/>
-        </w:rPr>
-      </w:pPr>
-      <w:r>
-        <w:rPr>
-          <w:color w:val="000000"/>
-        </w:rPr>
-        <w:t xml:space="preserve">Data yang di </w:t>
-      </w:r>
-      <w:proofErr w:type="spellStart"/>
-      <w:r>
-        <w:rPr>
-          <w:color w:val="000000"/>
-        </w:rPr>
-        <w:t>perlukan</w:t>
-      </w:r>
-      <w:proofErr w:type="spellEnd"/>
-      <w:proofErr w:type="gramStart"/>
-      <w:r>
-        <w:rPr>
-          <w:color w:val="000000"/>
-        </w:rPr>
-        <w:tab/>
-        <w:t xml:space="preserve"> :</w:t>
-      </w:r>
-      <w:proofErr w:type="gramEnd"/>
-      <w:r>
-        <w:rPr>
-          <w:color w:val="000000"/>
-        </w:rPr>
-        <w:t xml:space="preserve"> ${data}</w:t>
-      </w:r>
-    </w:p>
-    <w:p>
-      <w:pPr>
-        <w:pBdr>
-          <w:top w:val="nil"/>
-          <w:left w:val="nil"/>
-          <w:bottom w:val="nil"/>
-          <w:right w:val="nil"/>
-          <w:between w:val="nil"/>
-        </w:pBdr>
-        <w:ind w:left="1440"/>
-        <w:jc w:val="both"/>
-        <w:rPr>
-          <w:color w:val="000000"/>
-        </w:rPr>
-      </w:pPr>
-    </w:p>
-    <w:p>
-      <w:pPr>
-        <w:pBdr>
-          <w:top w:val="nil"/>
-          <w:left w:val="nil"/>
-          <w:bottom w:val="nil"/>
-          <w:right w:val="nil"/>
-          <w:between w:val="nil"/>
-        </w:pBdr>
-        <w:ind w:left="1440"/>
-        <w:jc w:val="both"/>
-        <w:rPr>
-          <w:color w:val="000000"/>
-        </w:rPr>
-      </w:pPr>
-      <w:proofErr w:type="spellStart"/>
-      <w:r>
-        <w:rPr>
-          <w:color w:val="000000"/>
-        </w:rPr>
-        <w:t>Demikianlah</w:t>
+      <w:proofErr w:type="spellStart"/>
+      <w:r>
+        <w:rPr>
+          <w:color w:val="000000"/>
+        </w:rPr>
+        <w:t>Praktik</w:t>
+      </w:r>
+      <w:proofErr w:type="spellEnd"/>
+      <w:r>
+        <w:rPr>
+          <w:color w:val="000000"/>
+        </w:rPr>
+        <w:t xml:space="preserve"> (KP) </w:t>
+      </w:r>
+      <w:proofErr w:type="spellStart"/>
+      <w:r>
+        <w:rPr>
+          <w:color w:val="000000"/>
+        </w:rPr>
+        <w:t>ini</w:t>
+      </w:r>
+      <w:proofErr w:type="spellEnd"/>
+      <w:r>
+        <w:rPr>
+          <w:color w:val="000000"/>
+        </w:rPr>
+        <w:t xml:space="preserve"> kami </w:t>
+      </w:r>
+      <w:proofErr w:type="spellStart"/>
+      <w:r>
+        <w:rPr>
+          <w:color w:val="000000"/>
+        </w:rPr>
+        <w:t>sampaikan</w:t>
+      </w:r>
+      <w:proofErr w:type="spellEnd"/>
+      <w:r>
+        <w:rPr>
+          <w:color w:val="000000"/>
+        </w:rPr>
+        <w:t xml:space="preserve">, </w:t>
+      </w:r>
+      <w:proofErr w:type="spellStart"/>
+      <w:r>
+        <w:rPr>
+          <w:color w:val="000000"/>
+        </w:rPr>
+        <w:t>semoga</w:t>
+      </w:r>
+      <w:proofErr w:type="spellEnd"/>
+      <w:r>
+        <w:rPr>
+          <w:color w:val="000000"/>
+        </w:rPr>
+        <w:t xml:space="preserve"> Bapak/Ibu </w:t>
+      </w:r>
+      <w:proofErr w:type="spellStart"/>
+      <w:r>
+        <w:rPr>
+          <w:color w:val="000000"/>
+        </w:rPr>
+        <w:t>dapat</w:t>
       </w:r>
       <w:proofErr w:type="spellEnd"/>
       <w:r>
@@ -1939,7 +2022,21 @@
         <w:rPr>
           <w:color w:val="000000"/>
         </w:rPr>
-        <w:t>surat</w:t>
+        <w:t>menerima</w:t>
+      </w:r>
+      <w:proofErr w:type="spellEnd"/>
+      <w:r>
+        <w:rPr>
+          <w:color w:val="000000"/>
+        </w:rPr>
+        <w:t xml:space="preserve"> dan </w:t>
+      </w:r>
+      <w:proofErr w:type="spellStart"/>
+      <w:r>
+        <w:rPr>
+          <w:color w:val="000000"/>
+        </w:rPr>
+        <w:t>membingbing</w:t>
       </w:r>
       <w:proofErr w:type="spellEnd"/>
       <w:r>
@@ -1953,7 +2050,41 @@
         <w:rPr>
           <w:color w:val="000000"/>
         </w:rPr>
-        <w:t>pengantar</w:t>
+        <w:t>mahasiswa</w:t>
+      </w:r>
+      <w:proofErr w:type="spellEnd"/>
+      <w:r>
+        <w:rPr>
+          <w:color w:val="000000"/>
+        </w:rPr>
+        <w:t xml:space="preserve"> kami.</w:t>
+      </w:r>
+      <w:r>
+        <w:rPr>
+          <w:color w:val="000000"/>
+        </w:rPr>
+        <w:t xml:space="preserve"> Atas </w:t>
+      </w:r>
+      <w:proofErr w:type="spellStart"/>
+      <w:r>
+        <w:rPr>
+          <w:color w:val="000000"/>
+        </w:rPr>
+        <w:t>perhatiannya</w:t>
+      </w:r>
+      <w:proofErr w:type="spellEnd"/>
+      <w:r>
+        <w:rPr>
+          <w:color w:val="000000"/>
+        </w:rPr>
+        <w:t xml:space="preserve"> kami </w:t>
+      </w:r>
+      <w:proofErr w:type="spellStart"/>
+      <w:r>
+        <w:rPr>
+          <w:color w:val="000000"/>
+        </w:rPr>
+        <w:t>ucapkan</w:t>
       </w:r>
       <w:proofErr w:type="spellEnd"/>
       <w:r>
@@ -1961,158 +2092,6 @@
           <w:color w:val="000000"/>
         </w:rPr>
         <w:t xml:space="preserve"> </w:t>
-      </w:r>
-      <w:proofErr w:type="spellStart"/>
-      <w:r>
-        <w:rPr>
-          <w:color w:val="000000"/>
-        </w:rPr>
-        <w:t>Kerja</w:t>
-      </w:r>
-      <w:proofErr w:type="spellEnd"/>
-      <w:r>
-        <w:rPr>
-          <w:color w:val="000000"/>
-        </w:rPr>
-        <w:t xml:space="preserve"> </w:t>
-      </w:r>
-      <w:proofErr w:type="spellStart"/>
-      <w:r>
-        <w:rPr>
-          <w:color w:val="000000"/>
-        </w:rPr>
-        <w:t>Praktik</w:t>
-      </w:r>
-      <w:proofErr w:type="spellEnd"/>
-      <w:r>
-        <w:rPr>
-          <w:color w:val="000000"/>
-        </w:rPr>
-        <w:t xml:space="preserve"> (KP) </w:t>
-      </w:r>
-      <w:proofErr w:type="spellStart"/>
-      <w:r>
-        <w:rPr>
-          <w:color w:val="000000"/>
-        </w:rPr>
-        <w:t>ini</w:t>
-      </w:r>
-      <w:proofErr w:type="spellEnd"/>
-      <w:r>
-        <w:rPr>
-          <w:color w:val="000000"/>
-        </w:rPr>
-        <w:t xml:space="preserve"> kami </w:t>
-      </w:r>
-      <w:proofErr w:type="spellStart"/>
-      <w:r>
-        <w:rPr>
-          <w:color w:val="000000"/>
-        </w:rPr>
-        <w:t>sampaikan</w:t>
-      </w:r>
-      <w:proofErr w:type="spellEnd"/>
-      <w:r>
-        <w:rPr>
-          <w:color w:val="000000"/>
-        </w:rPr>
-        <w:t xml:space="preserve">, </w:t>
-      </w:r>
-      <w:proofErr w:type="spellStart"/>
-      <w:r>
-        <w:rPr>
-          <w:color w:val="000000"/>
-        </w:rPr>
-        <w:t>semoga</w:t>
-      </w:r>
-      <w:proofErr w:type="spellEnd"/>
-      <w:r>
-        <w:rPr>
-          <w:color w:val="000000"/>
-        </w:rPr>
-        <w:t xml:space="preserve"> Bapak/Ibu </w:t>
-      </w:r>
-      <w:proofErr w:type="spellStart"/>
-      <w:r>
-        <w:rPr>
-          <w:color w:val="000000"/>
-        </w:rPr>
-        <w:t>dapat</w:t>
-      </w:r>
-      <w:proofErr w:type="spellEnd"/>
-      <w:r>
-        <w:rPr>
-          <w:color w:val="000000"/>
-        </w:rPr>
-        <w:t xml:space="preserve"> </w:t>
-      </w:r>
-      <w:proofErr w:type="spellStart"/>
-      <w:r>
-        <w:rPr>
-          <w:color w:val="000000"/>
-        </w:rPr>
-        <w:t>menerima</w:t>
-      </w:r>
-      <w:proofErr w:type="spellEnd"/>
-      <w:r>
-        <w:rPr>
-          <w:color w:val="000000"/>
-        </w:rPr>
-        <w:t xml:space="preserve"> dan </w:t>
-      </w:r>
-      <w:proofErr w:type="spellStart"/>
-      <w:r>
-        <w:rPr>
-          <w:color w:val="000000"/>
-        </w:rPr>
-        <w:t>membingbing</w:t>
-      </w:r>
-      <w:proofErr w:type="spellEnd"/>
-      <w:r>
-        <w:rPr>
-          <w:color w:val="000000"/>
-        </w:rPr>
-        <w:t xml:space="preserve"> </w:t>
-      </w:r>
-      <w:proofErr w:type="spellStart"/>
-      <w:r>
-        <w:rPr>
-          <w:color w:val="000000"/>
-        </w:rPr>
-        <w:t>mahasiswa</w:t>
-      </w:r>
-      <w:proofErr w:type="spellEnd"/>
-      <w:r>
-        <w:rPr>
-          <w:color w:val="000000"/>
-        </w:rPr>
-        <w:t xml:space="preserve"> kami.</w:t>
-      </w:r>
-      <w:r>
-        <w:rPr>
-          <w:color w:val="000000"/>
-        </w:rPr>
-        <w:t xml:space="preserve"> </w:t>
-      </w:r>
-      <w:r>
-        <w:rPr>
-          <w:color w:val="000000"/>
-        </w:rPr>
-        <w:t xml:space="preserve">Atas </w:t>
-      </w:r>
-      <w:proofErr w:type="spellStart"/>
-      <w:r>
-        <w:rPr>
-          <w:color w:val="000000"/>
-        </w:rPr>
-        <w:t>perhatiannya</w:t>
-      </w:r>
-      <w:proofErr w:type="spellEnd"/>
-      <w:r>
-        <w:rPr>
-          <w:color w:val="000000"/>
-        </w:rPr>
-        <w:t xml:space="preserve"> kami ucapkan </w:t>
       </w:r>
       <w:proofErr w:type="spellStart"/>
       <w:r>
@@ -3335,6 +3314,7 @@
   <w:style w:type="character" w:default="1" w:styleId="DefaultParagraphFont">
     <w:name w:val="Default Paragraph Font"/>
     <w:uiPriority w:val="1"/>
+    <w:semiHidden/>
     <w:unhideWhenUsed/>
   </w:style>
   <w:style w:type="table" w:default="1" w:styleId="TableNormal">

</xml_diff>

<commit_message>
feat(letter-templates): update template variables and add login layout
- Add new DOCX templates for different letter types
- Replace template variables with consistent naming (namaPemohon)
- Create dedicated login layout for auth pages
- Update page titles from "Arsip Surat" to "Pengajuan Surat"
- Remove unused coba.docx template
</commit_message>
<xml_diff>
--- a/storage/app/public/templates/Surat Pengantar Kerja Praktik.docx
+++ b/storage/app/public/templates/Surat Pengantar Kerja Praktik.docx
@@ -410,46 +410,21 @@
         <w:ind w:left="5472" w:firstLine="287"/>
         <w:rPr>
           <w:color w:val="000000"/>
-        </w:rPr>
-      </w:pPr>
-      <w:proofErr w:type="spellStart"/>
-      <w:proofErr w:type="gramStart"/>
-      <w:r>
-        <w:rPr>
-          <w:color w:val="000000"/>
-        </w:rPr>
-        <w:t>T</w:t>
-      </w:r>
-      <w:r>
-        <w:rPr>
-          <w:color w:val="000000"/>
-        </w:rPr>
-        <w:t>asikmalaya</w:t>
-      </w:r>
-      <w:proofErr w:type="spellEnd"/>
-      <w:r>
-        <w:rPr>
-          <w:color w:val="000000"/>
-        </w:rPr>
-        <w:t>,</w:t>
-      </w:r>
-      <w:r>
-        <w:rPr>
-          <w:color w:val="000000"/>
-        </w:rPr>
-        <w:t>$</w:t>
-      </w:r>
-      <w:proofErr w:type="gramEnd"/>
-      <w:r>
-        <w:rPr>
-          <w:color w:val="000000"/>
-        </w:rPr>
-        <w:t>{</w:t>
-      </w:r>
-      <w:proofErr w:type="spellStart"/>
-      <w:r>
-        <w:rPr>
-          <w:color w:val="000000"/>
+          <w:lang w:val="id-ID"/>
+        </w:rPr>
+      </w:pPr>
+      <w:r>
+        <w:rPr>
+          <w:color w:val="000000"/>
+          <w:lang w:val="id-ID"/>
+        </w:rPr>
+        <w:t>Tasikmalaya,${</w:t>
+      </w:r>
+      <w:proofErr w:type="spellStart"/>
+      <w:r>
+        <w:rPr>
+          <w:color w:val="000000"/>
+          <w:lang w:val="id-ID"/>
         </w:rPr>
         <w:t>tglSurat</w:t>
       </w:r>
@@ -457,6 +432,7 @@
       <w:r>
         <w:rPr>
           <w:color w:val="000000"/>
+          <w:lang w:val="id-ID"/>
         </w:rPr>
         <w:t>}</w:t>
       </w:r>
@@ -473,6 +449,7 @@
         <w:ind w:left="5472" w:firstLine="287"/>
         <w:rPr>
           <w:color w:val="000000"/>
+          <w:lang w:val="id-ID"/>
         </w:rPr>
       </w:pPr>
     </w:p>
@@ -487,39 +464,36 @@
         </w:pBdr>
         <w:rPr>
           <w:color w:val="000000"/>
-        </w:rPr>
-      </w:pPr>
-      <w:proofErr w:type="spellStart"/>
-      <w:r>
-        <w:rPr>
-          <w:color w:val="000000"/>
+          <w:lang w:val="id-ID"/>
+        </w:rPr>
+      </w:pPr>
+      <w:r>
+        <w:rPr>
+          <w:color w:val="000000"/>
+          <w:lang w:val="id-ID"/>
         </w:rPr>
         <w:t>Nomor</w:t>
       </w:r>
-      <w:proofErr w:type="spellEnd"/>
-      <w:r>
-        <w:rPr>
-          <w:color w:val="000000"/>
+      <w:r>
+        <w:rPr>
+          <w:color w:val="000000"/>
+          <w:lang w:val="id-ID"/>
         </w:rPr>
         <w:tab/>
       </w:r>
       <w:r>
         <w:rPr>
           <w:color w:val="000000"/>
+          <w:lang w:val="id-ID"/>
         </w:rPr>
         <w:tab/>
-        <w:t>:</w:t>
-      </w:r>
-      <w:r>
-        <w:rPr>
-          <w:color w:val="000000"/>
-        </w:rPr>
-        <w:t xml:space="preserve">   ${</w:t>
-      </w:r>
-      <w:proofErr w:type="spellStart"/>
-      <w:r>
-        <w:rPr>
-          <w:color w:val="000000"/>
+        <w:t>:   ${</w:t>
+      </w:r>
+      <w:proofErr w:type="spellStart"/>
+      <w:r>
+        <w:rPr>
+          <w:color w:val="000000"/>
+          <w:lang w:val="id-ID"/>
         </w:rPr>
         <w:t>noSurat</w:t>
       </w:r>
@@ -527,60 +501,9 @@
       <w:r>
         <w:rPr>
           <w:color w:val="000000"/>
-        </w:rPr>
-        <w:t>}</w:t>
-      </w:r>
-      <w:r>
-        <w:rPr>
-          <w:color w:val="000000"/>
-        </w:rPr>
-        <w:t>/</w:t>
-      </w:r>
-      <w:r>
-        <w:rPr>
-          <w:color w:val="000000"/>
-        </w:rPr>
-        <w:t>KP</w:t>
-      </w:r>
-      <w:r>
-        <w:rPr>
-          <w:color w:val="000000"/>
-        </w:rPr>
-        <w:t>/FT-UP</w:t>
-      </w:r>
-      <w:r>
-        <w:rPr>
-          <w:color w:val="000000"/>
-        </w:rPr>
-        <w:t>/${</w:t>
-      </w:r>
-      <w:proofErr w:type="spellStart"/>
-      <w:r>
-        <w:rPr>
-          <w:color w:val="000000"/>
-        </w:rPr>
-        <w:t>bulan</w:t>
-      </w:r>
-      <w:proofErr w:type="spellEnd"/>
-      <w:r>
-        <w:rPr>
-          <w:color w:val="000000"/>
-        </w:rPr>
-        <w:t>}/${</w:t>
-      </w:r>
-      <w:proofErr w:type="spellStart"/>
-      <w:r>
-        <w:rPr>
-          <w:color w:val="000000"/>
-        </w:rPr>
-        <w:t>tahun</w:t>
-      </w:r>
-      <w:proofErr w:type="spellEnd"/>
-      <w:r>
-        <w:rPr>
-          <w:color w:val="000000"/>
-        </w:rPr>
-        <w:t>}</w:t>
+          <w:lang w:val="id-ID"/>
+        </w:rPr>
+        <w:t>}/KP/FT-UP/${bulan}/${tahun}</w:t>
       </w:r>
     </w:p>
     <w:p>
@@ -594,26 +517,23 @@
         </w:pBdr>
         <w:rPr>
           <w:color w:val="000000"/>
-        </w:rPr>
-      </w:pPr>
-      <w:r>
-        <w:rPr>
-          <w:color w:val="000000"/>
+          <w:lang w:val="fi-FI"/>
+        </w:rPr>
+      </w:pPr>
+      <w:r>
+        <w:rPr>
+          <w:color w:val="000000"/>
+          <w:lang w:val="fi-FI"/>
         </w:rPr>
         <w:t>Lampiran</w:t>
       </w:r>
       <w:r>
         <w:rPr>
           <w:color w:val="000000"/>
+          <w:lang w:val="fi-FI"/>
         </w:rPr>
         <w:tab/>
-        <w:t xml:space="preserve">: </w:t>
-      </w:r>
-      <w:r>
-        <w:rPr>
-          <w:color w:val="000000"/>
-        </w:rPr>
-        <w:t xml:space="preserve">  -</w:t>
+        <w:t>:   -</w:t>
       </w:r>
     </w:p>
     <w:p>
@@ -627,90 +547,30 @@
         </w:pBdr>
         <w:rPr>
           <w:color w:val="000000"/>
-        </w:rPr>
-      </w:pPr>
-      <w:proofErr w:type="spellStart"/>
-      <w:r>
-        <w:rPr>
-          <w:color w:val="000000"/>
+          <w:lang w:val="fi-FI"/>
+        </w:rPr>
+      </w:pPr>
+      <w:r>
+        <w:rPr>
+          <w:color w:val="000000"/>
+          <w:lang w:val="fi-FI"/>
         </w:rPr>
         <w:t>Perihal</w:t>
       </w:r>
-      <w:proofErr w:type="spellEnd"/>
-      <w:r>
-        <w:rPr>
-          <w:color w:val="000000"/>
+      <w:r>
+        <w:rPr>
+          <w:color w:val="000000"/>
+          <w:lang w:val="fi-FI"/>
         </w:rPr>
         <w:tab/>
       </w:r>
       <w:r>
         <w:rPr>
           <w:color w:val="000000"/>
+          <w:lang w:val="fi-FI"/>
         </w:rPr>
         <w:tab/>
-        <w:t xml:space="preserve">: </w:t>
-      </w:r>
-      <w:r>
-        <w:rPr>
-          <w:color w:val="000000"/>
-        </w:rPr>
-        <w:t xml:space="preserve">  </w:t>
-      </w:r>
-      <w:proofErr w:type="spellStart"/>
-      <w:r>
-        <w:rPr>
-          <w:color w:val="000000"/>
-        </w:rPr>
-        <w:t>Pengantar</w:t>
-      </w:r>
-      <w:proofErr w:type="spellEnd"/>
-      <w:r>
-        <w:rPr>
-          <w:color w:val="000000"/>
-        </w:rPr>
-        <w:t xml:space="preserve"> </w:t>
-      </w:r>
-      <w:proofErr w:type="spellStart"/>
-      <w:r>
-        <w:rPr>
-          <w:color w:val="000000"/>
-        </w:rPr>
-        <w:t>Izin</w:t>
-      </w:r>
-      <w:proofErr w:type="spellEnd"/>
-      <w:r>
-        <w:rPr>
-          <w:color w:val="000000"/>
-        </w:rPr>
-        <w:t xml:space="preserve"> </w:t>
-      </w:r>
-      <w:proofErr w:type="spellStart"/>
-      <w:r>
-        <w:rPr>
-          <w:color w:val="000000"/>
-        </w:rPr>
-        <w:t>Kerja</w:t>
-      </w:r>
-      <w:proofErr w:type="spellEnd"/>
-      <w:r>
-        <w:rPr>
-          <w:color w:val="000000"/>
-        </w:rPr>
-        <w:t xml:space="preserve"> </w:t>
-      </w:r>
-      <w:proofErr w:type="spellStart"/>
-      <w:r>
-        <w:rPr>
-          <w:color w:val="000000"/>
-        </w:rPr>
-        <w:t>Praktik</w:t>
-      </w:r>
-      <w:proofErr w:type="spellEnd"/>
-      <w:r>
-        <w:rPr>
-          <w:color w:val="000000"/>
-        </w:rPr>
-        <w:t xml:space="preserve"> (KP)</w:t>
+        <w:t>:   Pengantar Izin Kerja Praktik (KP)</w:t>
       </w:r>
     </w:p>
     <w:p>
@@ -724,6 +584,7 @@
         </w:pBdr>
         <w:rPr>
           <w:color w:val="000000"/>
+          <w:lang w:val="fi-FI"/>
         </w:rPr>
       </w:pPr>
     </w:p>
@@ -738,6 +599,7 @@
         </w:pBdr>
         <w:rPr>
           <w:color w:val="000000"/>
+          <w:lang w:val="fi-FI"/>
         </w:rPr>
       </w:pPr>
     </w:p>
@@ -752,6 +614,7 @@
         </w:pBdr>
         <w:rPr>
           <w:color w:val="000000"/>
+          <w:lang w:val="fi-FI"/>
         </w:rPr>
       </w:pPr>
     </w:p>
@@ -766,42 +629,23 @@
         </w:pBdr>
         <w:rPr>
           <w:color w:val="000000"/>
-        </w:rPr>
-      </w:pPr>
-      <w:proofErr w:type="spellStart"/>
-      <w:r>
-        <w:rPr>
-          <w:color w:val="000000"/>
-        </w:rPr>
-        <w:t>Kepada</w:t>
-      </w:r>
-      <w:proofErr w:type="spellEnd"/>
-      <w:r>
-        <w:rPr>
-          <w:color w:val="000000"/>
-        </w:rPr>
-        <w:t xml:space="preserve"> </w:t>
-      </w:r>
-      <w:proofErr w:type="spellStart"/>
-      <w:r>
-        <w:rPr>
-          <w:color w:val="000000"/>
-        </w:rPr>
-        <w:t>Yth</w:t>
-      </w:r>
-      <w:proofErr w:type="spellEnd"/>
-      <w:r>
-        <w:rPr>
-          <w:color w:val="000000"/>
+          <w:lang w:val="fi-FI"/>
+        </w:rPr>
+      </w:pPr>
+      <w:r>
+        <w:rPr>
+          <w:color w:val="000000"/>
+          <w:lang w:val="fi-FI"/>
+        </w:rPr>
+        <w:t>Kepada Yth</w:t>
+      </w:r>
+      <w:r>
+        <w:rPr>
+          <w:color w:val="000000"/>
+          <w:lang w:val="fi-FI"/>
         </w:rPr>
         <w:tab/>
-        <w:t>:</w:t>
-      </w:r>
-      <w:r>
-        <w:rPr>
-          <w:color w:val="000000"/>
-        </w:rPr>
-        <w:t xml:space="preserve">   Dekan</w:t>
+        <w:t>:   Dekan</w:t>
       </w:r>
     </w:p>
     <w:p>
@@ -815,43 +659,24 @@
         </w:pBdr>
         <w:rPr>
           <w:color w:val="000000"/>
-        </w:rPr>
-      </w:pPr>
-      <w:r>
-        <w:rPr>
-          <w:color w:val="000000"/>
+          <w:lang w:val="fi-FI"/>
+        </w:rPr>
+      </w:pPr>
+      <w:r>
+        <w:rPr>
+          <w:color w:val="000000"/>
+          <w:lang w:val="fi-FI"/>
         </w:rPr>
         <w:tab/>
       </w:r>
       <w:r>
         <w:rPr>
           <w:color w:val="000000"/>
+          <w:lang w:val="fi-FI"/>
         </w:rPr>
         <w:tab/>
-        <w:t xml:space="preserve">    </w:t>
-      </w:r>
-      <w:proofErr w:type="spellStart"/>
-      <w:r>
-        <w:rPr>
-          <w:color w:val="000000"/>
-        </w:rPr>
-        <w:t>Fakultas</w:t>
-      </w:r>
-      <w:proofErr w:type="spellEnd"/>
-      <w:r>
-        <w:rPr>
-          <w:color w:val="000000"/>
-        </w:rPr>
-        <w:t xml:space="preserve"> Teknik Universitas </w:t>
-      </w:r>
-      <w:proofErr w:type="spellStart"/>
-      <w:r>
-        <w:rPr>
-          <w:color w:val="000000"/>
-        </w:rPr>
-        <w:t>Perjuangan</w:t>
-      </w:r>
-      <w:proofErr w:type="spellEnd"/>
+        <w:t xml:space="preserve">    Fakultas Teknik Universitas Perjuangan</w:t>
+      </w:r>
     </w:p>
     <w:p>
       <w:pPr>
@@ -869,43 +694,17 @@
       <w:r>
         <w:rPr>
           <w:color w:val="000000"/>
+          <w:lang w:val="fi-FI"/>
         </w:rPr>
         <w:tab/>
       </w:r>
       <w:r>
         <w:rPr>
           <w:color w:val="000000"/>
+          <w:lang w:val="fi-FI"/>
         </w:rPr>
         <w:tab/>
-        <w:t xml:space="preserve">    Jl. Peta NO.177, </w:t>
-      </w:r>
-      <w:proofErr w:type="spellStart"/>
-      <w:r>
-        <w:rPr>
-          <w:color w:val="000000"/>
-        </w:rPr>
-        <w:t>Kahuripan</w:t>
-      </w:r>
-      <w:proofErr w:type="spellEnd"/>
-      <w:r>
-        <w:rPr>
-          <w:color w:val="000000"/>
-        </w:rPr>
-        <w:t xml:space="preserve">, </w:t>
-      </w:r>
-      <w:proofErr w:type="spellStart"/>
-      <w:r>
-        <w:rPr>
-          <w:color w:val="000000"/>
-        </w:rPr>
-        <w:t>Kec</w:t>
-      </w:r>
-      <w:proofErr w:type="spellEnd"/>
-      <w:r>
-        <w:rPr>
-          <w:color w:val="000000"/>
-        </w:rPr>
-        <w:t xml:space="preserve">. </w:t>
+        <w:t xml:space="preserve">    Jl. Peta NO.177, Kahuripan, Kec. </w:t>
       </w:r>
       <w:proofErr w:type="spellStart"/>
       <w:r>
@@ -988,13 +787,7 @@
           <w:color w:val="000000"/>
         </w:rPr>
         <w:tab/>
-        <w:t xml:space="preserve"> </w:t>
-      </w:r>
-      <w:r>
-        <w:rPr>
-          <w:color w:val="000000"/>
-        </w:rPr>
-        <w:t xml:space="preserve"> </w:t>
+        <w:t xml:space="preserve">  </w:t>
       </w:r>
     </w:p>
     <w:p>
@@ -1613,7 +1406,6 @@
         <w:t xml:space="preserve"> </w:t>
       </w:r>
       <w:proofErr w:type="spellStart"/>
-      <w:proofErr w:type="gramStart"/>
       <w:r>
         <w:rPr>
           <w:color w:val="000000"/>
@@ -1627,7 +1419,6 @@
         </w:rPr>
         <w:t xml:space="preserve"> :</w:t>
       </w:r>
-      <w:proofErr w:type="gramEnd"/>
     </w:p>
     <w:p>
       <w:pPr>
@@ -1645,6 +1436,307 @@
         </w:rPr>
       </w:pPr>
     </w:p>
+    <w:tbl>
+      <w:tblPr>
+        <w:tblStyle w:val="TableGrid"/>
+        <w:tblW w:w="0" w:type="auto"/>
+        <w:tblInd w:w="1440" w:type="dxa"/>
+        <w:tblBorders>
+          <w:top w:val="none" w:sz="0" w:space="0" w:color="auto"/>
+          <w:left w:val="none" w:sz="0" w:space="0" w:color="auto"/>
+          <w:bottom w:val="none" w:sz="0" w:space="0" w:color="auto"/>
+          <w:right w:val="none" w:sz="0" w:space="0" w:color="auto"/>
+          <w:insideH w:val="none" w:sz="0" w:space="0" w:color="auto"/>
+          <w:insideV w:val="none" w:sz="0" w:space="0" w:color="auto"/>
+        </w:tblBorders>
+        <w:tblLook w:val="04A0" w:firstRow="1" w:lastRow="0" w:firstColumn="1" w:lastColumn="0" w:noHBand="0" w:noVBand="1"/>
+      </w:tblPr>
+      <w:tblGrid>
+        <w:gridCol w:w="2383"/>
+        <w:gridCol w:w="283"/>
+        <w:gridCol w:w="4910"/>
+      </w:tblGrid>
+      <w:tr>
+        <w:tc>
+          <w:tcPr>
+            <w:tcW w:w="2383" w:type="dxa"/>
+          </w:tcPr>
+          <w:p>
+            <w:pPr>
+              <w:jc w:val="both"/>
+              <w:rPr>
+                <w:color w:val="000000"/>
+              </w:rPr>
+            </w:pPr>
+            <w:r>
+              <w:rPr>
+                <w:color w:val="000000"/>
+              </w:rPr>
+              <w:t>Nama</w:t>
+            </w:r>
+          </w:p>
+        </w:tc>
+        <w:tc>
+          <w:tcPr>
+            <w:tcW w:w="283" w:type="dxa"/>
+          </w:tcPr>
+          <w:p>
+            <w:pPr>
+              <w:jc w:val="center"/>
+              <w:rPr>
+                <w:color w:val="000000"/>
+              </w:rPr>
+            </w:pPr>
+            <w:r>
+              <w:rPr>
+                <w:color w:val="000000"/>
+              </w:rPr>
+              <w:t>:</w:t>
+            </w:r>
+          </w:p>
+        </w:tc>
+        <w:tc>
+          <w:tcPr>
+            <w:tcW w:w="4910" w:type="dxa"/>
+          </w:tcPr>
+          <w:p>
+            <w:pPr>
+              <w:jc w:val="both"/>
+              <w:rPr>
+                <w:color w:val="000000"/>
+              </w:rPr>
+            </w:pPr>
+            <w:r>
+              <w:rPr>
+                <w:color w:val="000000"/>
+              </w:rPr>
+              <w:t>$</w:t>
+            </w:r>
+            <w:r>
+              <w:rPr>
+                <w:color w:val="000000"/>
+              </w:rPr>
+              <w:t>{</w:t>
+            </w:r>
+            <w:proofErr w:type="spellStart"/>
+            <w:r>
+              <w:rPr>
+                <w:color w:val="000000"/>
+              </w:rPr>
+              <w:t>namaPemohon</w:t>
+            </w:r>
+            <w:proofErr w:type="spellEnd"/>
+            <w:r>
+              <w:rPr>
+                <w:color w:val="000000"/>
+              </w:rPr>
+              <w:t>}</w:t>
+            </w:r>
+          </w:p>
+        </w:tc>
+      </w:tr>
+      <w:tr>
+        <w:tc>
+          <w:tcPr>
+            <w:tcW w:w="2383" w:type="dxa"/>
+          </w:tcPr>
+          <w:p>
+            <w:pPr>
+              <w:jc w:val="both"/>
+              <w:rPr>
+                <w:color w:val="000000"/>
+              </w:rPr>
+            </w:pPr>
+            <w:r>
+              <w:rPr>
+                <w:color w:val="000000"/>
+              </w:rPr>
+              <w:t>NIM</w:t>
+            </w:r>
+          </w:p>
+        </w:tc>
+        <w:tc>
+          <w:tcPr>
+            <w:tcW w:w="283" w:type="dxa"/>
+          </w:tcPr>
+          <w:p>
+            <w:pPr>
+              <w:jc w:val="center"/>
+              <w:rPr>
+                <w:color w:val="000000"/>
+              </w:rPr>
+            </w:pPr>
+            <w:r>
+              <w:rPr>
+                <w:color w:val="000000"/>
+              </w:rPr>
+              <w:t>:</w:t>
+            </w:r>
+          </w:p>
+        </w:tc>
+        <w:tc>
+          <w:tcPr>
+            <w:tcW w:w="4910" w:type="dxa"/>
+          </w:tcPr>
+          <w:p>
+            <w:pPr>
+              <w:jc w:val="both"/>
+              <w:rPr>
+                <w:color w:val="000000"/>
+              </w:rPr>
+            </w:pPr>
+            <w:r>
+              <w:rPr>
+                <w:color w:val="000000"/>
+              </w:rPr>
+              <w:t>${nim}</w:t>
+            </w:r>
+          </w:p>
+        </w:tc>
+      </w:tr>
+      <w:tr>
+        <w:tc>
+          <w:tcPr>
+            <w:tcW w:w="2383" w:type="dxa"/>
+          </w:tcPr>
+          <w:p>
+            <w:pPr>
+              <w:jc w:val="both"/>
+              <w:rPr>
+                <w:color w:val="000000"/>
+              </w:rPr>
+            </w:pPr>
+            <w:proofErr w:type="spellStart"/>
+            <w:r>
+              <w:rPr>
+                <w:color w:val="000000"/>
+              </w:rPr>
+              <w:t>Judul</w:t>
+            </w:r>
+            <w:proofErr w:type="spellEnd"/>
+          </w:p>
+        </w:tc>
+        <w:tc>
+          <w:tcPr>
+            <w:tcW w:w="283" w:type="dxa"/>
+          </w:tcPr>
+          <w:p>
+            <w:pPr>
+              <w:jc w:val="center"/>
+              <w:rPr>
+                <w:color w:val="000000"/>
+              </w:rPr>
+            </w:pPr>
+            <w:r>
+              <w:rPr>
+                <w:color w:val="000000"/>
+              </w:rPr>
+              <w:t>:</w:t>
+            </w:r>
+          </w:p>
+        </w:tc>
+        <w:tc>
+          <w:tcPr>
+            <w:tcW w:w="4910" w:type="dxa"/>
+          </w:tcPr>
+          <w:p>
+            <w:pPr>
+              <w:jc w:val="both"/>
+              <w:rPr>
+                <w:color w:val="000000"/>
+              </w:rPr>
+            </w:pPr>
+            <w:r>
+              <w:rPr>
+                <w:color w:val="000000"/>
+              </w:rPr>
+              <w:t>${</w:t>
+            </w:r>
+            <w:proofErr w:type="spellStart"/>
+            <w:r>
+              <w:rPr>
+                <w:color w:val="000000"/>
+              </w:rPr>
+              <w:t>judulKP</w:t>
+            </w:r>
+            <w:proofErr w:type="spellEnd"/>
+            <w:r>
+              <w:rPr>
+                <w:color w:val="000000"/>
+              </w:rPr>
+              <w:t>}</w:t>
+            </w:r>
+          </w:p>
+        </w:tc>
+      </w:tr>
+      <w:tr>
+        <w:tc>
+          <w:tcPr>
+            <w:tcW w:w="2383" w:type="dxa"/>
+          </w:tcPr>
+          <w:p>
+            <w:pPr>
+              <w:jc w:val="both"/>
+              <w:rPr>
+                <w:color w:val="000000"/>
+              </w:rPr>
+            </w:pPr>
+            <w:r>
+              <w:rPr>
+                <w:color w:val="000000"/>
+              </w:rPr>
+              <w:t xml:space="preserve">Data yang </w:t>
+            </w:r>
+            <w:proofErr w:type="spellStart"/>
+            <w:r>
+              <w:rPr>
+                <w:color w:val="000000"/>
+              </w:rPr>
+              <w:t>diperlukan</w:t>
+            </w:r>
+            <w:proofErr w:type="spellEnd"/>
+          </w:p>
+        </w:tc>
+        <w:tc>
+          <w:tcPr>
+            <w:tcW w:w="283" w:type="dxa"/>
+          </w:tcPr>
+          <w:p>
+            <w:pPr>
+              <w:jc w:val="center"/>
+              <w:rPr>
+                <w:color w:val="000000"/>
+              </w:rPr>
+            </w:pPr>
+            <w:r>
+              <w:rPr>
+                <w:color w:val="000000"/>
+              </w:rPr>
+              <w:t>:</w:t>
+            </w:r>
+          </w:p>
+        </w:tc>
+        <w:tc>
+          <w:tcPr>
+            <w:tcW w:w="4910" w:type="dxa"/>
+          </w:tcPr>
+          <w:p>
+            <w:pPr>
+              <w:jc w:val="both"/>
+              <w:rPr>
+                <w:color w:val="000000"/>
+              </w:rPr>
+            </w:pPr>
+            <w:r>
+              <w:rPr>
+                <w:color w:val="000000"/>
+              </w:rPr>
+              <w:t>${data}</w:t>
+            </w:r>
+          </w:p>
+        </w:tc>
+      </w:tr>
+    </w:tbl>
     <w:p>
       <w:pPr>
         <w:pBdr>
@@ -1660,51 +1752,6 @@
           <w:color w:val="000000"/>
         </w:rPr>
       </w:pPr>
-      <w:r>
-        <w:rPr>
-          <w:color w:val="000000"/>
-        </w:rPr>
-        <w:t>Nama</w:t>
-      </w:r>
-      <w:r>
-        <w:rPr>
-          <w:color w:val="000000"/>
-        </w:rPr>
-        <w:tab/>
-      </w:r>
-      <w:r>
-        <w:rPr>
-          <w:color w:val="000000"/>
-        </w:rPr>
-        <w:tab/>
-      </w:r>
-      <w:proofErr w:type="gramStart"/>
-      <w:r>
-        <w:rPr>
-          <w:color w:val="000000"/>
-        </w:rPr>
-        <w:tab/>
-        <w:t xml:space="preserve"> </w:t>
-      </w:r>
-      <w:r>
-        <w:rPr>
-          <w:color w:val="000000"/>
-        </w:rPr>
-        <w:t>:</w:t>
-      </w:r>
-      <w:proofErr w:type="gramEnd"/>
-      <w:r>
-        <w:rPr>
-          <w:color w:val="000000"/>
-        </w:rPr>
-        <w:t xml:space="preserve"> </w:t>
-      </w:r>
-      <w:r>
-        <w:rPr>
-          <w:color w:val="000000"/>
-        </w:rPr>
-        <w:t>${nama}</w:t>
-      </w:r>
     </w:p>
     <w:p>
       <w:pPr>
@@ -1721,211 +1768,124 @@
           <w:color w:val="000000"/>
         </w:rPr>
       </w:pPr>
-      <w:r>
-        <w:rPr>
-          <w:color w:val="000000"/>
-        </w:rPr>
-        <w:t>NIM</w:t>
-      </w:r>
-      <w:r>
-        <w:rPr>
-          <w:color w:val="000000"/>
-        </w:rPr>
-        <w:tab/>
-      </w:r>
-      <w:r>
-        <w:rPr>
-          <w:color w:val="000000"/>
-        </w:rPr>
-        <w:tab/>
-      </w:r>
-      <w:proofErr w:type="gramStart"/>
-      <w:r>
-        <w:rPr>
-          <w:color w:val="000000"/>
-        </w:rPr>
-        <w:tab/>
+      <w:proofErr w:type="spellStart"/>
+      <w:r>
+        <w:rPr>
+          <w:color w:val="000000"/>
+        </w:rPr>
+        <w:t>Demikianlah</w:t>
+      </w:r>
+      <w:proofErr w:type="spellEnd"/>
+      <w:r>
+        <w:rPr>
+          <w:color w:val="000000"/>
+        </w:rPr>
         <w:t xml:space="preserve"> </w:t>
       </w:r>
-      <w:r>
-        <w:rPr>
-          <w:color w:val="000000"/>
-        </w:rPr>
-        <w:t>:</w:t>
-      </w:r>
-      <w:proofErr w:type="gramEnd"/>
+      <w:proofErr w:type="spellStart"/>
+      <w:r>
+        <w:rPr>
+          <w:color w:val="000000"/>
+        </w:rPr>
+        <w:t>surat</w:t>
+      </w:r>
+      <w:proofErr w:type="spellEnd"/>
       <w:r>
         <w:rPr>
           <w:color w:val="000000"/>
         </w:rPr>
         <w:t xml:space="preserve"> </w:t>
       </w:r>
-      <w:r>
-        <w:rPr>
-          <w:color w:val="000000"/>
-        </w:rPr>
-        <w:t>${nim}</w:t>
-      </w:r>
-    </w:p>
-    <w:p>
-      <w:pPr>
-        <w:pBdr>
-          <w:top w:val="nil"/>
-          <w:left w:val="nil"/>
-          <w:bottom w:val="nil"/>
-          <w:right w:val="nil"/>
-          <w:between w:val="nil"/>
-        </w:pBdr>
-        <w:ind w:left="1440"/>
-        <w:jc w:val="both"/>
-        <w:rPr>
-          <w:color w:val="000000"/>
-        </w:rPr>
-      </w:pPr>
-      <w:proofErr w:type="spellStart"/>
-      <w:r>
-        <w:rPr>
-          <w:color w:val="000000"/>
-        </w:rPr>
-        <w:t>Judul</w:t>
-      </w:r>
-      <w:proofErr w:type="spellEnd"/>
-      <w:r>
-        <w:rPr>
-          <w:color w:val="000000"/>
-        </w:rPr>
-        <w:tab/>
-      </w:r>
-      <w:r>
-        <w:rPr>
-          <w:color w:val="000000"/>
-        </w:rPr>
-        <w:tab/>
-      </w:r>
-      <w:proofErr w:type="gramStart"/>
-      <w:r>
-        <w:rPr>
-          <w:color w:val="000000"/>
-        </w:rPr>
-        <w:tab/>
+      <w:proofErr w:type="spellStart"/>
+      <w:r>
+        <w:rPr>
+          <w:color w:val="000000"/>
+        </w:rPr>
+        <w:t>pengantar</w:t>
+      </w:r>
+      <w:proofErr w:type="spellEnd"/>
+      <w:r>
+        <w:rPr>
+          <w:color w:val="000000"/>
+        </w:rPr>
         <w:t xml:space="preserve"> </w:t>
       </w:r>
-      <w:r>
-        <w:rPr>
-          <w:color w:val="000000"/>
-        </w:rPr>
-        <w:t>:</w:t>
-      </w:r>
-      <w:proofErr w:type="gramEnd"/>
+      <w:proofErr w:type="spellStart"/>
+      <w:r>
+        <w:rPr>
+          <w:color w:val="000000"/>
+        </w:rPr>
+        <w:t>Kerja</w:t>
+      </w:r>
+      <w:proofErr w:type="spellEnd"/>
       <w:r>
         <w:rPr>
           <w:color w:val="000000"/>
         </w:rPr>
         <w:t xml:space="preserve"> </w:t>
       </w:r>
-      <w:r>
-        <w:rPr>
-          <w:color w:val="000000"/>
-        </w:rPr>
-        <w:t>${</w:t>
-      </w:r>
-      <w:proofErr w:type="spellStart"/>
-      <w:r>
-        <w:rPr>
-          <w:color w:val="000000"/>
-        </w:rPr>
-        <w:t>judulKP</w:t>
-      </w:r>
-      <w:proofErr w:type="spellEnd"/>
-      <w:r>
-        <w:rPr>
-          <w:color w:val="000000"/>
-        </w:rPr>
-        <w:t>}</w:t>
-      </w:r>
-    </w:p>
-    <w:p>
-      <w:pPr>
-        <w:pBdr>
-          <w:top w:val="nil"/>
-          <w:left w:val="nil"/>
-          <w:bottom w:val="nil"/>
-          <w:right w:val="nil"/>
-          <w:between w:val="nil"/>
-        </w:pBdr>
-        <w:ind w:left="1440"/>
-        <w:jc w:val="both"/>
-        <w:rPr>
-          <w:color w:val="000000"/>
-        </w:rPr>
-      </w:pPr>
-      <w:r>
-        <w:rPr>
-          <w:color w:val="000000"/>
-        </w:rPr>
-        <w:t xml:space="preserve">Data yang di </w:t>
-      </w:r>
-      <w:proofErr w:type="spellStart"/>
-      <w:r>
-        <w:rPr>
-          <w:color w:val="000000"/>
-        </w:rPr>
-        <w:t>perlukan</w:t>
-      </w:r>
-      <w:proofErr w:type="spellEnd"/>
-      <w:proofErr w:type="gramStart"/>
-      <w:r>
-        <w:rPr>
-          <w:color w:val="000000"/>
-        </w:rPr>
-        <w:tab/>
-        <w:t xml:space="preserve"> :</w:t>
-      </w:r>
-      <w:proofErr w:type="gramEnd"/>
-      <w:r>
-        <w:rPr>
-          <w:color w:val="000000"/>
-        </w:rPr>
-        <w:t xml:space="preserve"> ${data}</w:t>
-      </w:r>
-    </w:p>
-    <w:p>
-      <w:pPr>
-        <w:pBdr>
-          <w:top w:val="nil"/>
-          <w:left w:val="nil"/>
-          <w:bottom w:val="nil"/>
-          <w:right w:val="nil"/>
-          <w:between w:val="nil"/>
-        </w:pBdr>
-        <w:ind w:left="1440"/>
-        <w:jc w:val="both"/>
-        <w:rPr>
-          <w:color w:val="000000"/>
-        </w:rPr>
-      </w:pPr>
-    </w:p>
-    <w:p>
-      <w:pPr>
-        <w:pBdr>
-          <w:top w:val="nil"/>
-          <w:left w:val="nil"/>
-          <w:bottom w:val="nil"/>
-          <w:right w:val="nil"/>
-          <w:between w:val="nil"/>
-        </w:pBdr>
-        <w:ind w:left="1440"/>
-        <w:jc w:val="both"/>
-        <w:rPr>
-          <w:color w:val="000000"/>
-        </w:rPr>
-      </w:pPr>
-      <w:proofErr w:type="spellStart"/>
-      <w:r>
-        <w:rPr>
-          <w:color w:val="000000"/>
-        </w:rPr>
-        <w:t>Demikianlah</w:t>
+      <w:proofErr w:type="spellStart"/>
+      <w:r>
+        <w:rPr>
+          <w:color w:val="000000"/>
+        </w:rPr>
+        <w:t>Praktik</w:t>
+      </w:r>
+      <w:proofErr w:type="spellEnd"/>
+      <w:r>
+        <w:rPr>
+          <w:color w:val="000000"/>
+        </w:rPr>
+        <w:t xml:space="preserve"> (KP) </w:t>
+      </w:r>
+      <w:proofErr w:type="spellStart"/>
+      <w:r>
+        <w:rPr>
+          <w:color w:val="000000"/>
+        </w:rPr>
+        <w:t>ini</w:t>
+      </w:r>
+      <w:proofErr w:type="spellEnd"/>
+      <w:r>
+        <w:rPr>
+          <w:color w:val="000000"/>
+        </w:rPr>
+        <w:t xml:space="preserve"> kami </w:t>
+      </w:r>
+      <w:proofErr w:type="spellStart"/>
+      <w:r>
+        <w:rPr>
+          <w:color w:val="000000"/>
+        </w:rPr>
+        <w:t>sampaikan</w:t>
+      </w:r>
+      <w:proofErr w:type="spellEnd"/>
+      <w:r>
+        <w:rPr>
+          <w:color w:val="000000"/>
+        </w:rPr>
+        <w:t xml:space="preserve">, </w:t>
+      </w:r>
+      <w:proofErr w:type="spellStart"/>
+      <w:r>
+        <w:rPr>
+          <w:color w:val="000000"/>
+        </w:rPr>
+        <w:t>semoga</w:t>
+      </w:r>
+      <w:proofErr w:type="spellEnd"/>
+      <w:r>
+        <w:rPr>
+          <w:color w:val="000000"/>
+        </w:rPr>
+        <w:t xml:space="preserve"> Bapak/Ibu </w:t>
+      </w:r>
+      <w:proofErr w:type="spellStart"/>
+      <w:r>
+        <w:rPr>
+          <w:color w:val="000000"/>
+        </w:rPr>
+        <w:t>dapat</w:t>
       </w:r>
       <w:proofErr w:type="spellEnd"/>
       <w:r>
@@ -1939,7 +1899,21 @@
         <w:rPr>
           <w:color w:val="000000"/>
         </w:rPr>
-        <w:t>surat</w:t>
+        <w:t>menerima</w:t>
+      </w:r>
+      <w:proofErr w:type="spellEnd"/>
+      <w:r>
+        <w:rPr>
+          <w:color w:val="000000"/>
+        </w:rPr>
+        <w:t xml:space="preserve"> dan </w:t>
+      </w:r>
+      <w:proofErr w:type="spellStart"/>
+      <w:r>
+        <w:rPr>
+          <w:color w:val="000000"/>
+        </w:rPr>
+        <w:t>membingbing</w:t>
       </w:r>
       <w:proofErr w:type="spellEnd"/>
       <w:r>
@@ -1953,7 +1927,41 @@
         <w:rPr>
           <w:color w:val="000000"/>
         </w:rPr>
-        <w:t>pengantar</w:t>
+        <w:t>mahasiswa</w:t>
+      </w:r>
+      <w:proofErr w:type="spellEnd"/>
+      <w:r>
+        <w:rPr>
+          <w:color w:val="000000"/>
+        </w:rPr>
+        <w:t xml:space="preserve"> kami.</w:t>
+      </w:r>
+      <w:r>
+        <w:rPr>
+          <w:color w:val="000000"/>
+        </w:rPr>
+        <w:t xml:space="preserve"> Atas </w:t>
+      </w:r>
+      <w:proofErr w:type="spellStart"/>
+      <w:r>
+        <w:rPr>
+          <w:color w:val="000000"/>
+        </w:rPr>
+        <w:t>perhatiannya</w:t>
+      </w:r>
+      <w:proofErr w:type="spellEnd"/>
+      <w:r>
+        <w:rPr>
+          <w:color w:val="000000"/>
+        </w:rPr>
+        <w:t xml:space="preserve"> kami </w:t>
+      </w:r>
+      <w:proofErr w:type="spellStart"/>
+      <w:r>
+        <w:rPr>
+          <w:color w:val="000000"/>
+        </w:rPr>
+        <w:t>ucapkan</w:t>
       </w:r>
       <w:proofErr w:type="spellEnd"/>
       <w:r>
@@ -1961,158 +1969,6 @@
           <w:color w:val="000000"/>
         </w:rPr>
         <w:t xml:space="preserve"> </w:t>
-      </w:r>
-      <w:proofErr w:type="spellStart"/>
-      <w:r>
-        <w:rPr>
-          <w:color w:val="000000"/>
-        </w:rPr>
-        <w:t>Kerja</w:t>
-      </w:r>
-      <w:proofErr w:type="spellEnd"/>
-      <w:r>
-        <w:rPr>
-          <w:color w:val="000000"/>
-        </w:rPr>
-        <w:t xml:space="preserve"> </w:t>
-      </w:r>
-      <w:proofErr w:type="spellStart"/>
-      <w:r>
-        <w:rPr>
-          <w:color w:val="000000"/>
-        </w:rPr>
-        <w:t>Praktik</w:t>
-      </w:r>
-      <w:proofErr w:type="spellEnd"/>
-      <w:r>
-        <w:rPr>
-          <w:color w:val="000000"/>
-        </w:rPr>
-        <w:t xml:space="preserve"> (KP) </w:t>
-      </w:r>
-      <w:proofErr w:type="spellStart"/>
-      <w:r>
-        <w:rPr>
-          <w:color w:val="000000"/>
-        </w:rPr>
-        <w:t>ini</w:t>
-      </w:r>
-      <w:proofErr w:type="spellEnd"/>
-      <w:r>
-        <w:rPr>
-          <w:color w:val="000000"/>
-        </w:rPr>
-        <w:t xml:space="preserve"> kami </w:t>
-      </w:r>
-      <w:proofErr w:type="spellStart"/>
-      <w:r>
-        <w:rPr>
-          <w:color w:val="000000"/>
-        </w:rPr>
-        <w:t>sampaikan</w:t>
-      </w:r>
-      <w:proofErr w:type="spellEnd"/>
-      <w:r>
-        <w:rPr>
-          <w:color w:val="000000"/>
-        </w:rPr>
-        <w:t xml:space="preserve">, </w:t>
-      </w:r>
-      <w:proofErr w:type="spellStart"/>
-      <w:r>
-        <w:rPr>
-          <w:color w:val="000000"/>
-        </w:rPr>
-        <w:t>semoga</w:t>
-      </w:r>
-      <w:proofErr w:type="spellEnd"/>
-      <w:r>
-        <w:rPr>
-          <w:color w:val="000000"/>
-        </w:rPr>
-        <w:t xml:space="preserve"> Bapak/Ibu </w:t>
-      </w:r>
-      <w:proofErr w:type="spellStart"/>
-      <w:r>
-        <w:rPr>
-          <w:color w:val="000000"/>
-        </w:rPr>
-        <w:t>dapat</w:t>
-      </w:r>
-      <w:proofErr w:type="spellEnd"/>
-      <w:r>
-        <w:rPr>
-          <w:color w:val="000000"/>
-        </w:rPr>
-        <w:t xml:space="preserve"> </w:t>
-      </w:r>
-      <w:proofErr w:type="spellStart"/>
-      <w:r>
-        <w:rPr>
-          <w:color w:val="000000"/>
-        </w:rPr>
-        <w:t>menerima</w:t>
-      </w:r>
-      <w:proofErr w:type="spellEnd"/>
-      <w:r>
-        <w:rPr>
-          <w:color w:val="000000"/>
-        </w:rPr>
-        <w:t xml:space="preserve"> dan </w:t>
-      </w:r>
-      <w:proofErr w:type="spellStart"/>
-      <w:r>
-        <w:rPr>
-          <w:color w:val="000000"/>
-        </w:rPr>
-        <w:t>membingbing</w:t>
-      </w:r>
-      <w:proofErr w:type="spellEnd"/>
-      <w:r>
-        <w:rPr>
-          <w:color w:val="000000"/>
-        </w:rPr>
-        <w:t xml:space="preserve"> </w:t>
-      </w:r>
-      <w:proofErr w:type="spellStart"/>
-      <w:r>
-        <w:rPr>
-          <w:color w:val="000000"/>
-        </w:rPr>
-        <w:t>mahasiswa</w:t>
-      </w:r>
-      <w:proofErr w:type="spellEnd"/>
-      <w:r>
-        <w:rPr>
-          <w:color w:val="000000"/>
-        </w:rPr>
-        <w:t xml:space="preserve"> kami.</w:t>
-      </w:r>
-      <w:r>
-        <w:rPr>
-          <w:color w:val="000000"/>
-        </w:rPr>
-        <w:t xml:space="preserve"> </w:t>
-      </w:r>
-      <w:r>
-        <w:rPr>
-          <w:color w:val="000000"/>
-        </w:rPr>
-        <w:t xml:space="preserve">Atas </w:t>
-      </w:r>
-      <w:proofErr w:type="spellStart"/>
-      <w:r>
-        <w:rPr>
-          <w:color w:val="000000"/>
-        </w:rPr>
-        <w:t>perhatiannya</w:t>
-      </w:r>
-      <w:proofErr w:type="spellEnd"/>
-      <w:r>
-        <w:rPr>
-          <w:color w:val="000000"/>
-        </w:rPr>
-        <w:t xml:space="preserve"> kami ucapkan </w:t>
       </w:r>
       <w:proofErr w:type="spellStart"/>
       <w:r>
@@ -2181,26 +2037,16 @@
                           <w:p>
                             <w:pPr>
                               <w:textDirection w:val="btLr"/>
+                              <w:rPr>
+                                <w:lang w:val="fi-FI"/>
+                              </w:rPr>
                             </w:pPr>
                             <w:r>
                               <w:rPr>
                                 <w:color w:val="000000"/>
+                                <w:lang w:val="fi-FI"/>
                               </w:rPr>
-                              <w:t xml:space="preserve">Dekan </w:t>
-                            </w:r>
-                            <w:proofErr w:type="spellStart"/>
-                            <w:r>
-                              <w:rPr>
-                                <w:color w:val="000000"/>
-                              </w:rPr>
-                              <w:t>Fakultas</w:t>
-                            </w:r>
-                            <w:proofErr w:type="spellEnd"/>
-                            <w:r>
-                              <w:rPr>
-                                <w:color w:val="000000"/>
-                              </w:rPr>
-                              <w:t xml:space="preserve"> Teknik</w:t>
+                              <w:t>Dekan Fakultas Teknik</w:t>
                             </w:r>
                           </w:p>
                           <w:p>
@@ -2208,54 +2054,46 @@
                               <w:spacing w:line="258" w:lineRule="auto"/>
                               <w:jc w:val="center"/>
                               <w:textDirection w:val="btLr"/>
+                              <w:rPr>
+                                <w:lang w:val="fi-FI"/>
+                              </w:rPr>
                             </w:pPr>
                           </w:p>
                           <w:p>
                             <w:pPr>
                               <w:textDirection w:val="btLr"/>
+                              <w:rPr>
+                                <w:lang w:val="fi-FI"/>
+                              </w:rPr>
                             </w:pPr>
                             <w:r>
                               <w:rPr>
                                 <w:color w:val="000000"/>
+                                <w:lang w:val="fi-FI"/>
                               </w:rPr>
-                              <w:t xml:space="preserve">Tanda </w:t>
+                              <w:t>Tanda tangan dan cap jabatan</w:t>
                             </w:r>
-                            <w:proofErr w:type="spellStart"/>
-                            <w:r>
-                              <w:rPr>
-                                <w:color w:val="000000"/>
-                              </w:rPr>
-                              <w:t>tangan</w:t>
-                            </w:r>
-                            <w:proofErr w:type="spellEnd"/>
-                            <w:r>
-                              <w:rPr>
-                                <w:color w:val="000000"/>
-                              </w:rPr>
-                              <w:t xml:space="preserve"> dan cap </w:t>
-                            </w:r>
-                            <w:proofErr w:type="spellStart"/>
-                            <w:r>
-                              <w:rPr>
-                                <w:color w:val="000000"/>
-                              </w:rPr>
-                              <w:t>jabatan</w:t>
-                            </w:r>
-                            <w:proofErr w:type="spellEnd"/>
                           </w:p>
                           <w:p>
                             <w:pPr>
                               <w:textDirection w:val="btLr"/>
+                              <w:rPr>
+                                <w:lang w:val="fi-FI"/>
+                              </w:rPr>
                             </w:pPr>
                           </w:p>
                           <w:p>
                             <w:pPr>
                               <w:textDirection w:val="btLr"/>
+                              <w:rPr>
+                                <w:lang w:val="fi-FI"/>
+                              </w:rPr>
                             </w:pPr>
                             <w:r>
                               <w:rPr>
                                 <w:color w:val="000000"/>
                                 <w:u w:val="single"/>
+                                <w:lang w:val="fi-FI"/>
                               </w:rPr>
                               <w:t xml:space="preserve">NAMA PEJABAT </w:t>
                             </w:r>
@@ -2263,10 +2101,14 @@
                           <w:p>
                             <w:pPr>
                               <w:textDirection w:val="btLr"/>
+                              <w:rPr>
+                                <w:lang w:val="fi-FI"/>
+                              </w:rPr>
                             </w:pPr>
                             <w:r>
                               <w:rPr>
                                 <w:color w:val="000000"/>
+                                <w:lang w:val="fi-FI"/>
                               </w:rPr>
                               <w:t>NIP/NIDN/NUPTK/NIDN. …………………</w:t>
                             </w:r>
@@ -2276,6 +2118,9 @@
                               <w:spacing w:line="258" w:lineRule="auto"/>
                               <w:jc w:val="center"/>
                               <w:textDirection w:val="btLr"/>
+                              <w:rPr>
+                                <w:lang w:val="fi-FI"/>
+                              </w:rPr>
                             </w:pPr>
                           </w:p>
                         </w:txbxContent>
@@ -2298,26 +2143,16 @@
                     <w:p>
                       <w:pPr>
                         <w:textDirection w:val="btLr"/>
+                        <w:rPr>
+                          <w:lang w:val="fi-FI"/>
+                        </w:rPr>
                       </w:pPr>
                       <w:r>
                         <w:rPr>
                           <w:color w:val="000000"/>
+                          <w:lang w:val="fi-FI"/>
                         </w:rPr>
-                        <w:t xml:space="preserve">Dekan </w:t>
-                      </w:r>
-                      <w:proofErr w:type="spellStart"/>
-                      <w:r>
-                        <w:rPr>
-                          <w:color w:val="000000"/>
-                        </w:rPr>
-                        <w:t>Fakultas</w:t>
-                      </w:r>
-                      <w:proofErr w:type="spellEnd"/>
-                      <w:r>
-                        <w:rPr>
-                          <w:color w:val="000000"/>
-                        </w:rPr>
-                        <w:t xml:space="preserve"> Teknik</w:t>
+                        <w:t>Dekan Fakultas Teknik</w:t>
                       </w:r>
                     </w:p>
                     <w:p>
@@ -2325,54 +2160,46 @@
                         <w:spacing w:line="258" w:lineRule="auto"/>
                         <w:jc w:val="center"/>
                         <w:textDirection w:val="btLr"/>
+                        <w:rPr>
+                          <w:lang w:val="fi-FI"/>
+                        </w:rPr>
                       </w:pPr>
                     </w:p>
                     <w:p>
                       <w:pPr>
                         <w:textDirection w:val="btLr"/>
+                        <w:rPr>
+                          <w:lang w:val="fi-FI"/>
+                        </w:rPr>
                       </w:pPr>
                       <w:r>
                         <w:rPr>
                           <w:color w:val="000000"/>
+                          <w:lang w:val="fi-FI"/>
                         </w:rPr>
-                        <w:t xml:space="preserve">Tanda </w:t>
+                        <w:t>Tanda tangan dan cap jabatan</w:t>
                       </w:r>
-                      <w:proofErr w:type="spellStart"/>
-                      <w:r>
-                        <w:rPr>
-                          <w:color w:val="000000"/>
-                        </w:rPr>
-                        <w:t>tangan</w:t>
-                      </w:r>
-                      <w:proofErr w:type="spellEnd"/>
-                      <w:r>
-                        <w:rPr>
-                          <w:color w:val="000000"/>
-                        </w:rPr>
-                        <w:t xml:space="preserve"> dan cap </w:t>
-                      </w:r>
-                      <w:proofErr w:type="spellStart"/>
-                      <w:r>
-                        <w:rPr>
-                          <w:color w:val="000000"/>
-                        </w:rPr>
-                        <w:t>jabatan</w:t>
-                      </w:r>
-                      <w:proofErr w:type="spellEnd"/>
                     </w:p>
                     <w:p>
                       <w:pPr>
                         <w:textDirection w:val="btLr"/>
+                        <w:rPr>
+                          <w:lang w:val="fi-FI"/>
+                        </w:rPr>
                       </w:pPr>
                     </w:p>
                     <w:p>
                       <w:pPr>
                         <w:textDirection w:val="btLr"/>
+                        <w:rPr>
+                          <w:lang w:val="fi-FI"/>
+                        </w:rPr>
                       </w:pPr>
                       <w:r>
                         <w:rPr>
                           <w:color w:val="000000"/>
                           <w:u w:val="single"/>
+                          <w:lang w:val="fi-FI"/>
                         </w:rPr>
                         <w:t xml:space="preserve">NAMA PEJABAT </w:t>
                       </w:r>
@@ -2380,10 +2207,14 @@
                     <w:p>
                       <w:pPr>
                         <w:textDirection w:val="btLr"/>
+                        <w:rPr>
+                          <w:lang w:val="fi-FI"/>
+                        </w:rPr>
                       </w:pPr>
                       <w:r>
                         <w:rPr>
                           <w:color w:val="000000"/>
+                          <w:lang w:val="fi-FI"/>
                         </w:rPr>
                         <w:t>NIP/NIDN/NUPTK/NIDN. …………………</w:t>
                       </w:r>
@@ -2393,6 +2224,9 @@
                         <w:spacing w:line="258" w:lineRule="auto"/>
                         <w:jc w:val="center"/>
                         <w:textDirection w:val="btLr"/>
+                        <w:rPr>
+                          <w:lang w:val="fi-FI"/>
+                        </w:rPr>
                       </w:pPr>
                     </w:p>
                   </w:txbxContent>
@@ -3335,6 +3169,7 @@
   <w:style w:type="character" w:default="1" w:styleId="DefaultParagraphFont">
     <w:name w:val="Default Paragraph Font"/>
     <w:uiPriority w:val="1"/>
+    <w:semiHidden/>
     <w:unhideWhenUsed/>
   </w:style>
   <w:style w:type="table" w:default="1" w:styleId="TableNormal">

</xml_diff>